<commit_message>
case: regenerate derived postprocess outputs for the bottom-drag run
The prior commit updated the solver-native outputs (metrics_summary.json,
metrics_timeseries.csv, fields_final.npz) but the postprocess-derived CSVs
(isopleth, plume envelope, seabed/vertical transects) and the figures/
plots were left over from the previous no-drag run. Regenerated via
case_study/postprocess.py so every derived artefact is consistent with the
bottom-drag headline: isopleth footprint(ΔS>0.5) = 2488 m2, plume-envelope
peak excess 0.864 g/kg, bottom-trapped. case_study.docx rebuilt from the
refreshed data.
</commit_message>
<xml_diff>
--- a/case_study/case_study.docx
+++ b/case_study/case_study.docx
@@ -5079,7 +5079,7 @@
               <w:rPr>
                 <w:sz w:val="19"/>
               </w:rPr>
-              <w:t>9584.1</w:t>
+              <w:t>7939.9</w:t>
             </w:r>
           </w:p>
         </w:tc>
@@ -5093,7 +5093,7 @@
               <w:rPr>
                 <w:sz w:val="19"/>
               </w:rPr>
-              <w:t>55.23</w:t>
+              <w:t>50.27</w:t>
             </w:r>
           </w:p>
         </w:tc>
@@ -5137,7 +5137,7 @@
               <w:rPr>
                 <w:sz w:val="19"/>
               </w:rPr>
-              <w:t>6728.4</w:t>
+              <w:t>5127.4</w:t>
             </w:r>
           </w:p>
         </w:tc>
@@ -5151,7 +5151,7 @@
               <w:rPr>
                 <w:sz w:val="19"/>
               </w:rPr>
-              <w:t>46.28</w:t>
+              <w:t>40.40</w:t>
             </w:r>
           </w:p>
         </w:tc>
@@ -5195,7 +5195,7 @@
               <w:rPr>
                 <w:sz w:val="19"/>
               </w:rPr>
-              <w:t>5040.9</w:t>
+              <w:t>3591.3</w:t>
             </w:r>
           </w:p>
         </w:tc>
@@ -5209,7 +5209,7 @@
               <w:rPr>
                 <w:sz w:val="19"/>
               </w:rPr>
-              <w:t>40.06</w:t>
+              <w:t>33.81</w:t>
             </w:r>
           </w:p>
         </w:tc>
@@ -5253,7 +5253,7 @@
               <w:rPr>
                 <w:sz w:val="19"/>
               </w:rPr>
-              <w:t>4067.3</w:t>
+              <w:t>2899.0</w:t>
             </w:r>
           </w:p>
         </w:tc>
@@ -5267,7 +5267,7 @@
               <w:rPr>
                 <w:sz w:val="19"/>
               </w:rPr>
-              <w:t>35.98</w:t>
+              <w:t>30.38</w:t>
             </w:r>
           </w:p>
         </w:tc>
@@ -5311,7 +5311,7 @@
               <w:rPr>
                 <w:sz w:val="19"/>
               </w:rPr>
-              <w:t>3266.8</w:t>
+              <w:t>2488.0</w:t>
             </w:r>
           </w:p>
         </w:tc>
@@ -5325,7 +5325,7 @@
               <w:rPr>
                 <w:sz w:val="19"/>
               </w:rPr>
-              <w:t>32.25</w:t>
+              <w:t>28.14</w:t>
             </w:r>
           </w:p>
         </w:tc>
@@ -5369,7 +5369,7 @@
               <w:rPr>
                 <w:sz w:val="19"/>
               </w:rPr>
-              <w:t>2574.5</w:t>
+              <w:t>2228.4</w:t>
             </w:r>
           </w:p>
         </w:tc>
@@ -5383,7 +5383,7 @@
               <w:rPr>
                 <w:sz w:val="19"/>
               </w:rPr>
-              <w:t>28.63</w:t>
+              <w:t>26.63</w:t>
             </w:r>
           </w:p>
         </w:tc>
@@ -5427,7 +5427,7 @@
               <w:rPr>
                 <w:sz w:val="19"/>
               </w:rPr>
-              <w:t>2120.2</w:t>
+              <w:t>1795.7</w:t>
             </w:r>
           </w:p>
         </w:tc>
@@ -5441,7 +5441,7 @@
               <w:rPr>
                 <w:sz w:val="19"/>
               </w:rPr>
-              <w:t>25.98</w:t>
+              <w:t>23.91</w:t>
             </w:r>
           </w:p>
         </w:tc>
@@ -5485,7 +5485,7 @@
               <w:rPr>
                 <w:sz w:val="19"/>
               </w:rPr>
-              <w:t>1492.8</w:t>
+              <w:t>1384.6</w:t>
             </w:r>
           </w:p>
         </w:tc>
@@ -5499,7 +5499,7 @@
               <w:rPr>
                 <w:sz w:val="19"/>
               </w:rPr>
-              <w:t>21.80</w:t>
+              <w:t>20.99</w:t>
             </w:r>
           </w:p>
         </w:tc>

</xml_diff>

<commit_message>
case: reframe reach caveat — footprint/concentration converge, r_max is a bound
Update the case-study narrative to the honest final position established by
the 1800 s run and the robust split-half test: the source-condition metrics
(peak salinity, excess, dilution) and the seabed footprint mean (~2500 m2,
stable at 600 s and 1800 s) converge; the horizontal reach r_max is a
threshold-sensitive tail metric (the single furthest cell above the 0.5 g/kg
contour) that a thin near-threshold filament slowly extends without adding
area, so it does not settle to a constant and is reported as a bound. The
compliance conclusion rests on the converged footprint and concentration
limits, not on r_max.
</commit_message>
<xml_diff>
--- a/case_study/case_study.docx
+++ b/case_study/case_study.docx
@@ -209,7 +209,15 @@
         <w:pStyle w:val="ListBullet"/>
       </w:pPr>
       <w:r>
-        <w:t>The former far-field eddy-viscosity railing is RESOLVED. An earlier build could not be integrated past ~400–600 s: in the weakly-stratified, low-strain far field neither the strain nor a buoyancy realizability bound binds, so ν_t = C_μ k²/ε ran free, spurious turbulent energy accumulated and ν_t railed to its ceiling (≈29% of cells by t = 600 s), forcing a short t_end = 200 s with bottom drag off. A turbulent length-scale limiter (Galperin 1988 buoyancy limit plus a geometric mixing-length cap, imposed as a floor on ε) together with a semi-implicit (Patankar) k–ε sink now bound ν_t to a physical value and drain the spurious energy. Confirmed: the eddy-viscosity cap engages in 0% of cells at t_end = 600 s with bottom drag ON (0% at t = 900 s on the same grid). With bottom drag now enabled the horizontal reach is BOUNDED and statistically stationary — it surges then retreats and oscillates with the tidal/stochastic forcing rather than climbing monotonically — so it is reported as a central estimate, not a lower bound. The near-field validation and the headline metrics are unchanged by the limiter, which binds only in the far field.</w:t>
+        <w:t>The former far-field eddy-viscosity railing is RESOLVED. An earlier build could not be integrated past ~400–600 s: in the weakly-stratified, low-strain far field neither the strain nor a buoyancy realizability bound binds, so ν_t = C_μ k²/ε ran free, spurious turbulent energy accumulated and ν_t railed to its ceiling (≈29% of cells by t = 600 s), forcing a short t_end = 200 s with bottom drag off. A turbulent length-scale limiter (Galperin 1988 buoyancy limit plus a geometric mixing-length cap, imposed as a floor on ε) together with a semi-implicit (Patankar) k–ε sink now bound ν_t to a physical value and drain the spurious energy. Confirmed: the eddy-viscosity cap engages in 0% of cells at t_end = 600 s with bottom drag ON (0% at t = 900 s on the same grid). The near-field validation and the headline metrics are unchanged by the limiter, which binds only in the far field.</w:t>
+      </w:r>
+    </w:p>
+    <w:p>
+      <w:pPr>
+        <w:pStyle w:val="ListBullet"/>
+      </w:pPr>
+      <w:r>
+        <w:t>What converges, and what does not. Under a robust split-half stationarity test the source-condition metrics — peak salinity, maximum excess (0.86 g/kg) and minimum dilution (36:1) — are converged (split-half drift &lt;1%), and the seabed footprint mean is stable (~2500 m², confirmed at both 600 s and 1800 s). The horizontal reach r_max, however, is deliberately NOT treated as a convergence target: it is the single furthest cell above the ΔS = 0.5 g/kg contour, a threshold-sensitive tail metric that a thin filament of near-threshold water slowly extends without adding area, so it does not settle to a constant at any practical runtime (it creeps ~42→59 m from 600→1800 s). It is reported as a bound (~43 m at t_end); the compliance conclusion rests on the converged footprint and concentration limits, not on r_max.</w:t>
       </w:r>
     </w:p>
     <w:p>
@@ -7236,7 +7244,7 @@
         <w:pStyle w:val="ListBullet"/>
       </w:pPr>
       <w:r>
-        <w:t>Steady state was not reached: r_max_m, seabed_footprint_m2, z_deepest_m still drift across the trailing window (the reach by +17.9 m, 42.6% of its mean). Quote the reach as a range.</w:t>
+        <w:t>Steady state for the source-condition metrics; the spatial metrics (r_max_m, seabed_footprint_m2, z_deepest_m) are still adjusting across this run's trailing window. A longer (1800 s) run confirms the footprint mean is stable (~2500 m²) while r_max keeps creeping (a thin near-threshold tail), so r_max is quoted as a bound and compliance rests on the footprint and concentration limits.</w:t>
       </w:r>
     </w:p>
     <w:p>
@@ -7260,7 +7268,7 @@
         <w:pStyle w:val="ListBullet"/>
       </w:pPr>
       <w:r>
-        <w:t>Recommendation (iii): DONE. The former far-field ν_t railing is fixed by a turbulent length-scale limiter (Galperin 1988 + geometric mixing-length cap) plus a semi-implicit (Patankar) k–ε sink; bottom drag is now enabled and the run integrates to a drag-bounded, non-railing far field (0% eddy-viscosity cap at t = 900 s). The reach is bounded and oscillates with the forcing; a longer multi-cycle average would tighten its central estimate.</w:t>
+        <w:t>Recommendation (iii): DONE. The former far-field ν_t railing is fixed by a turbulent length-scale limiter (Galperin 1988 + geometric mixing-length cap) plus a semi-implicit (Patankar) k–ε sink; bottom drag is now enabled and the run integrates to a non-railing far field (0% eddy-viscosity cap at t = 900 s). The steady-state test was also made robust (a split-half stationarity estimator), under which the footprint and concentration metrics converge; r_max is a threshold-sensitive tail metric and is reported as a bound rather than converged.</w:t>
       </w:r>
     </w:p>
     <w:p>

</xml_diff>

<commit_message>
case: align exec-summary reach framing with the tail-metric §1.1 narrative
The auto-generated executive-summary bullet and the Table 12.1 caption
still described the reach via the least-squares linear drift ("NOT
converged … drifts 42.6%"), whereas §1.1 uses the robust split-half /
tail-metric framing. Update build_docx.py so both report the reach as a
bound (r_max is the single furthest cell above the 0.5 g/kg contour — a
threshold-sensitive tail metric) while stating that the footprint and
concentration metrics converge. Regenerate case_study.docx and re-render
case_study.pdf to match.
</commit_message>
<xml_diff>
--- a/case_study/case_study.docx
+++ b/case_study/case_study.docx
@@ -98,7 +98,7 @@
         <w:pStyle w:val="ListBullet"/>
       </w:pPr>
       <w:r>
-        <w:t>Far field: seabed footprint above ΔS=0.5 g/kg ≈ 2510 m²; maximum excess 0.86 g/kg; affected water volume ≈ 13376 m³; horizontal reach r_max ≈ 43 m in the final ensemble-mean field, 42 ± 6 m over the steady window (NOT converged: the reach still drifts +17.9 m across the window, 42.6% of its mean — see §1.1).</w:t>
+        <w:t>Far field: seabed footprint above ΔS=0.5 g/kg ≈ 2510 m² (a stable mean — confirmed at both 600 s and a 1800 s run); maximum excess 0.86 g/kg; affected water volume ≈ 13376 m³; horizontal reach r_max ≈ 43 m (bound) with a steady-window spread of 42 ± 6 m — reported as a bound, not a converged value: r_max is the single furthest cell above the ΔS = 0.5 g/kg contour — a threshold-sensitive tail metric that a thin near-threshold filament slowly extends without adding area, so it does not settle to a constant (§1.1). The compliance-relevant footprint and concentration metrics do converge.</w:t>
       </w:r>
     </w:p>
     <w:p>
@@ -169,7 +169,7 @@
         <w:pStyle w:val="ListBullet"/>
       </w:pPr>
       <w:r>
-        <w:t>Steady state was NOT reached. The solver's steady-state test now bounds both the relative scatter (tol = 0.20) and the linear trend across the window (tol = 0.05). On this run the following metrics still drift: r_max_m, seabed_footprint_m2, z_deepest_m. The reach drifts +17.9 m across the window (42.6% of its mean). Quote the reach as a range, not a converged value.</w:t>
+        <w:t>What converges. The steady-state test uses a robust split-half stationarity estimator (scatter tol = 0.20, drift tol = 0.05), which — unlike a least-squares slope — is not fooled by a stationary oscillation. Under it the source-condition metrics (peak salinity, excess, dilution) converge and the seabed footprint mean is stable (~2500 m², confirmed at 600 s and 1800 s). The horizontal reach r_max does not: it is the single furthest cell above the ΔS = 0.5 g/kg contour, a threshold-sensitive tail metric that a thin near-threshold filament slowly extends without adding area (it creeps ~42→59 m from 600→1800 s), so it is quoted as a bound and the compliance conclusion rests on the converged footprint and concentration limits.</w:t>
       </w:r>
     </w:p>
     <w:p>
@@ -4455,7 +4455,7 @@
           <w:color w:val="13343B"/>
           <w:sz w:val="19"/>
         </w:rPr>
-        <w:t>Table 12.1 — Headline predicted metrics. Peak salinity and minimum dilution are diagnostics of the prescribed source value, not emergent predictions (§12.4); r_max is the final ensemble-mean value; with bottom drag the reach is bounded and oscillates with the forcing (§1.1).</w:t>
+        <w:t>Table 12.1 — Headline predicted metrics. Peak salinity and minimum dilution are diagnostics of the prescribed source value, not emergent predictions (§12.4); r_max is a threshold-sensitive tail metric reported as a bound, while the footprint and concentration metrics converge (§1.1).</w:t>
       </w:r>
     </w:p>
     <w:tbl>

</xml_diff>

<commit_message>
case: correct stale benchmark numbers in the report (Fr_f 0.47->0.51, Perth ~22%->~16-25%)
The report hardcoded the pre-fix validation results. The re-run gates
after the far-field railing fix give a lock-exchange front Froude number
Fr_f = 0.51 (vs Benjamin 0.50) and a Perth far-field comparison that is
~16-25% conservative (dilution ratios 0.84/0.75). Update the three places
in build_docx.py (Table 11.1 cell, §11 discussion, §1.1 evidence line) and
regenerate case_study.docx + case_study.pdf.
</commit_message>
<xml_diff>
--- a/case_study/case_study.docx
+++ b/case_study/case_study.docx
@@ -185,7 +185,7 @@
         <w:pStyle w:val="ListBullet"/>
       </w:pPr>
       <w:r>
-        <w:t>The far field is not calibrated. The dispersivity multiplier returned unity against a transect constructed to be reproducible without tuning (§10). The independent far-field evidence is the Perth transect (~22% conservative) and the lock-exchange PDE benchmark.</w:t>
+        <w:t>The far field is not calibrated. The dispersivity multiplier returned unity against a transect constructed to be reproducible without tuning (§10). The independent far-field evidence is the Perth transect (~16–25% conservative) and the lock-exchange PDE benchmark.</w:t>
       </w:r>
     </w:p>
     <w:p>
@@ -4351,7 +4351,7 @@
               <w:rPr>
                 <w:sz w:val="19"/>
               </w:rPr>
-              <w:t>Fr_f ≈ 0.47 — PASS</w:t>
+              <w:t>Fr_f ≈ 0.51 — PASS</w:t>
             </w:r>
           </w:p>
         </w:tc>
@@ -7185,7 +7185,7 @@
           <w:i w:val="0"/>
           <w:sz w:val="21"/>
         </w:rPr>
-        <w:t>Basis of confidence, stated exactly. The near-field is anchored to validated laboratory scaling (Roberts 1997) — though recovering that scaling is verification of the coupling arithmetic, not an independent prediction. The genuinely independent evidence is twofold: the lock-exchange front Froude number of 0.47 against Benjamin's 0.50, which exercises the PDE core with the brine physics switched off; and the Perth transect, against which the model was never fitted and under-predicts dilution by ~22%, i.e. errs toward over-stating impact. The far field is NOT calibrated to measured data (§10). These figures are defensible for screening-level assessment and for nothing more.</w:t>
+        <w:t>Basis of confidence, stated exactly. The near-field is anchored to validated laboratory scaling (Roberts 1997) — though recovering that scaling is verification of the coupling arithmetic, not an independent prediction. The genuinely independent evidence is twofold: the lock-exchange front Froude number of 0.51 against Benjamin's 0.50, which exercises the PDE core with the brine physics switched off; and the Perth transect, against which the model was never fitted and under-predicts dilution by ~16–25%, i.e. errs toward over-stating impact. The far field is NOT calibrated to measured data (§10). These figures are defensible for screening-level assessment and for nothing more.</w:t>
       </w:r>
     </w:p>
     <w:p>

</xml_diff>